<commit_message>
Replace converter project with EA Sports analysis on CV
</commit_message>
<xml_diff>
--- a/Portfolio Website/Favour_Onyenike_Data_Analyst_Resume.docx
+++ b/Portfolio Website/Favour_Onyenike_Data_Analyst_Resume.docx
@@ -728,83 +728,54 @@
       </w:pPr>
       <w:r>
         <w:rPr>
-          <w:rFonts w:ascii="Times New Roman" w:cs="Times New Roman" w:eastAsia="Times New Roman" w:hAnsi="Times New Roman"/>
-          <w:b/>
-          <w:bCs/>
-          <w:color w:val="000000"/>
-          <w:sz w:val="21"/>
-          <w:szCs w:val="21"/>
-        </w:rPr>
-        <w:t xml:space="preserve">Currency Converter App</w:t>
-      </w:r>
-      <w:r>
-        <w:rPr>
-          <w:rFonts w:ascii="Times New Roman" w:cs="Times New Roman" w:eastAsia="Times New Roman" w:hAnsi="Times New Roman"/>
-          <w:color w:val="000000"/>
-          <w:sz w:val="21"/>
-          <w:szCs w:val="21"/>
-        </w:rPr>
-        <w:t xml:space="preserve">	</w:t>
-      </w:r>
-    </w:p>
-    <w:p>
-      <w:pPr>
-        <w:keepNext/>
-        <w:spacing w:after="30"/>
-      </w:pPr>
-      <w:r>
-        <w:rPr>
-          <w:rFonts w:ascii="Times New Roman" w:cs="Times New Roman" w:eastAsia="Times New Roman" w:hAnsi="Times New Roman"/>
-          <w:b/>
-          <w:bCs/>
-          <w:sz w:val="20"/>
-          <w:szCs w:val="20"/>
+          <w:b/>
+        </w:rPr>
+        <w:t>EA SPORTS FC 24 Player, Team &amp; League Analysis</w:t>
+      </w:r>
+      <w:r>
+        <w:tab/>
+        <w:t>October 2026</w:t>
+      </w:r>
+    </w:p>
+    <w:p>
+      <w:pPr>
+        <w:keepNext/>
+        <w:spacing w:after="30"/>
+      </w:pPr>
+      <w:r>
+        <w:rPr>
+          <w:b/>
         </w:rPr>
         <w:t xml:space="preserve">Tools: </w:t>
       </w:r>
       <w:r>
-        <w:rPr>
-          <w:rFonts w:ascii="Times New Roman" w:cs="Times New Roman" w:eastAsia="Times New Roman" w:hAnsi="Times New Roman"/>
-          <w:sz w:val="20"/>
-          <w:szCs w:val="20"/>
-        </w:rPr>
-        <w:t xml:space="preserve">Python, Tkinter, ExchangeRate-API</w:t>
-      </w:r>
-    </w:p>
-    <w:p>
-      <w:pPr>
-        <w:pStyle w:val="ListParagraph"/>
-        <w:numPr>
-          <w:ilvl w:val="0"/>
-          <w:numId w:val="2"/>
-        </w:numPr>
-        <w:spacing w:after="30"/>
-      </w:pPr>
-      <w:r>
-        <w:rPr>
-          <w:rFonts w:ascii="Times New Roman" w:cs="Times New Roman" w:eastAsia="Times New Roman" w:hAnsi="Times New Roman"/>
-          <w:sz w:val="20"/>
-          <w:szCs w:val="20"/>
-        </w:rPr>
-        <w:t xml:space="preserve">Built a desktop app that converts between multiple currencies, including USD, EUR, JPY, GBP, and NGN, using real-time exchange rates.</w:t>
-      </w:r>
-    </w:p>
-    <w:p>
-      <w:pPr>
-        <w:pStyle w:val="ListParagraph"/>
-        <w:numPr>
-          <w:ilvl w:val="0"/>
-          <w:numId w:val="2"/>
-        </w:numPr>
-        <w:spacing w:after="30"/>
-      </w:pPr>
-      <w:r>
-        <w:rPr>
-          <w:rFonts w:ascii="Times New Roman" w:cs="Times New Roman" w:eastAsia="Times New Roman" w:hAnsi="Times New Roman"/>
-          <w:sz w:val="20"/>
-          <w:szCs w:val="20"/>
-        </w:rPr>
-        <w:t xml:space="preserve">Added error handling for invalid inputs and API failures.</w:t>
+        <w:t>Excel, PivotTables, PivotCharts, Slicers</w:t>
+      </w:r>
+    </w:p>
+    <w:p>
+      <w:pPr>
+        <w:pStyle w:val="ListParagraph"/>
+        <w:numPr>
+          <w:ilvl w:val="0"/>
+          <w:numId w:val="2"/>
+        </w:numPr>
+        <w:spacing w:after="30"/>
+      </w:pPr>
+      <w:r>
+        <w:t>Analyzed 97,277 player records and 3,771 team records across FIFA 20-24, examining ratings, potential, age, wages, player values, team strength, club worth, budgets, and leagues.</w:t>
+      </w:r>
+    </w:p>
+    <w:p>
+      <w:pPr>
+        <w:pStyle w:val="ListParagraph"/>
+        <w:numPr>
+          <w:ilvl w:val="0"/>
+          <w:numId w:val="2"/>
+        </w:numPr>
+        <w:spacing w:after="30"/>
+      </w:pPr>
+      <w:r>
+        <w:t>Built three interactive dashboards with 18 PivotTables, eight charts, and FIFA-version and gender slicers to compare player, team, and league profiles.</w:t>
       </w:r>
     </w:p>
     <w:p>

</xml_diff>